<commit_message>
Apply Ch12-13 fix list and Ch15 tank fix to merged v2 chapters
Ch12: cut the raining line, vary "the way" similes (13 -> 8), butterfly
on Shu Chan's shoulder, promise as image. Ch13: Wado-ryu carried out of
the Old Era, Vayun trained responders before the modern divisions,
three-instance triad restored, Rohan's "it tested" line, two explaining
endings trimmed; unsent letter left out per author. Ch15: tank is the
tall cylinder with eyes closed (matches ch3). Canon sheet: tank and
Ch1-rewrite notes.

Co-Authored-By: Claude Opus 5.5 <noreply@anthropic.com>
</commit_message>
<xml_diff>
--- a/claude-notes/manuscript-v2/12-now-in-the-blue-i-merged.docx
+++ b/claude-notes/manuscript-v2/12-now-in-the-blue-i-merged.docx
@@ -59,7 +59,7 @@
           <w:b w:val="0"/>
           <w:i w:val="0"/>
         </w:rPr>
-        <w:t>Otto knew it the way you know things in dreams, all at once and without being able to say how. There was warm, and after the warm there was cool, and then warm again, slow as a tide coming in over flat sand. There was a pull in his arms that came and went, as if someone far away kept asking his muscles to lift something and then letting them rest. He didn't know who was asking, or what the weight was. His arms answered anyway, the way a dog answers a whistle from a man it's never met.</w:t>
+        <w:t>Otto knew it as you know things in dreams, all at once and without being able to say how. There was warm, and after the warm there was cool, and then warm again, slow as a tide coming in over flat sand. There was a pull in his arms that came and went, as if someone far away kept asking his muscles to lift something and then letting them rest. He didn't know who was asking, or what the weight was. His arms answered anyway, the way a dog answers a whistle from a man it's never met.</w:t>
       </w:r>
     </w:p>
     <w:p>
@@ -77,7 +77,7 @@
           <w:b w:val="0"/>
           <w:i w:val="0"/>
         </w:rPr>
-        <w:t>And there was the blue. He couldn't have said whether he saw it or only knew it: light through closed lids, maybe, or the color his mind gave to the deep place Master Chan had taught him to go, the color of the breath at an old man's skin. It was everywhere. It held him the way water holds a man who has stopped swimming.</w:t>
+        <w:t>And there was the blue. Whether he saw it or only knew it, he couldn't tell: light through closed lids, maybe, or the color his mind gave to the deep place Master Chan had taught him to go, the color of the breath at an old man's skin. It was everywhere. It held him the way water holds a man who has stopped swimming.</w:t>
       </w:r>
     </w:p>
     <w:p>
@@ -95,7 +95,7 @@
           <w:b w:val="0"/>
           <w:i w:val="0"/>
         </w:rPr>
-        <w:t>There had been a ring of stones. Ten of them, hanging in orange air over a floor of fire, and three people below who needed them to stay up. He remembered the weight of each stone separately, the way your tongue remembers each of your teeth. The fourth from the left had been the heavy one. It had kept wanting to turn.</w:t>
+        <w:t>There had been a ring of stones. Ten of them, hanging in orange air over a floor of fire, and three people below who needed them to stay up. He remembered the weight of each stone separately, as your tongue remembers each of your teeth. The fourth from the left had been the heavy one. It had kept wanting to turn.</w:t>
       </w:r>
     </w:p>
     <w:p>
@@ -159,7 +159,7 @@
           <w:b w:val="0"/>
           <w:i w:val="0"/>
         </w:rPr>
-        <w:t>So the promise was broken. It sat in the blue with him, and he knew it the way he knew the warm and the cool. Every time he thought about rising, Gage's face came first, upturned at the hole, waiting, and the thought of it weighed exactly what one more stone would weigh.</w:t>
+        <w:t>The promise sat in the blue with him, in two pieces, and he knew it the way he knew the warm and the cool. Every time he thought about rising, Gage's face came first, upturned at the hole, waiting, and the thought of it weighed exactly what one more stone would weigh.</w:t>
       </w:r>
     </w:p>
     <w:p>
@@ -177,7 +177,7 @@
           <w:b w:val="0"/>
           <w:i w:val="0"/>
         </w:rPr>
-        <w:t>They came from very far up, the way voices come down a shaft, flattened, their edges worn off by the distance. No words reached him. Only the shape of them: a lift at the end of a line, a pause, the lift again. One came more than the others. It had a pattern: a sentence, then a pause the exact length of a sentence, room left for a reply, then on without one. Patient, the way a person talks to a radio while he's got its back off. Otto almost knew that rhythm. He couldn't have said what it said. He could have said it was raining.</w:t>
+        <w:t>They came from very far up, like voices down a shaft, flattened, their edges worn off by the distance. No words reached him. Only the shape of them: a lift at the end of a line, a pause, the lift again. One came more than the others. It had a pattern: a sentence, then a pause the exact length of a sentence, room left for a reply, then on without one. Patient, the way a person talks to a radio while he's got its back off. Otto almost knew that rhythm.</w:t>
       </w:r>
     </w:p>
     <w:p>
@@ -186,7 +186,7 @@
           <w:b w:val="0"/>
           <w:i w:val="0"/>
         </w:rPr>
-        <w:t>Another came less often and said less. Mostly it sat. He could feel it through the blue the way one side of you goes warm when you sit near a boulder that's been in the sun all day.</w:t>
+        <w:t>Another came less often and said less. Mostly it sat. He could feel it through the blue, like one side of you going warm when you sit near a boulder that's been in the sun all day.</w:t>
       </w:r>
     </w:p>
     <w:p>
@@ -195,7 +195,7 @@
           <w:b w:val="0"/>
           <w:i w:val="0"/>
         </w:rPr>
-        <w:t>Whose they were, he couldn't have said. They were his. He was sure of that the way he was sure of his own back, which he'd never once seen.</w:t>
+        <w:t>Whose they were, he didn't know. They were his. He was sure of that as he was sure of his own back, which he'd never once seen.</w:t>
       </w:r>
     </w:p>
     <w:p>
@@ -294,7 +294,7 @@
           <w:b w:val="0"/>
           <w:i w:val="0"/>
         </w:rPr>
-        <w:t>The butterfly was on the windowsill that night, opening and closing. The proof. Otto didn't look at it much. It made his chest go tight, and he didn't want a word for that.</w:t>
+        <w:t>The butterfly was on his shoulder that night, opening and closing. The proof. Otto didn't look at it much. It made his chest go tight, and he didn't want a word for that.</w:t>
       </w:r>
     </w:p>
     <w:p>

</xml_diff>

<commit_message>
Ch12 round 2: Otto's near-escape toward the sitter; promise named; simile trims
Co-Authored-By: Claude Opus 5.5 <noreply@anthropic.com>
</commit_message>
<xml_diff>
--- a/claude-notes/manuscript-v2/12-now-in-the-blue-i-merged.docx
+++ b/claude-notes/manuscript-v2/12-now-in-the-blue-i-merged.docx
@@ -63,7 +63,7 @@
           <w:i w:val="0"/>
           <w:strike w:val="0"/>
         </w:rPr>
-        <w:t>Otto knew it as you know things in dreams, all at once and without being able to say how. There was warm, and after the warm there was cool, and then warm again, slow as a tide coming in over flat sand. There was a pull in his arms that came and went, as if someone far away kept asking his muscles to lift something and then letting them rest. He didn't know who was asking, or what the weight was. His arms answered anyway, the way a dog answers a whistle from a man it's never met.</w:t>
+        <w:t>Otto knew it as you know things in dreams, all at once and without being able to say how. There was warm, and after the warm there was cool, and then warm again. There was a pull in his arms that came and went, as if someone far away kept asking his muscles to lift something and then letting them rest. He didn't know who was asking, or what the weight was. His arms answered anyway.</w:t>
       </w:r>
     </w:p>
     <w:p>
@@ -93,7 +93,7 @@
           <w:i w:val="0"/>
           <w:strike w:val="0"/>
         </w:rPr>
-        <w:t>He had stopped swimming a long time ago. That much stayed.</w:t>
+        <w:t>He had stopped swimming a long time ago.</w:t>
       </w:r>
     </w:p>
     <w:p>
@@ -154,7 +154,7 @@
           <w:i w:val="0"/>
           <w:strike w:val="0"/>
         </w:rPr>
-        <w:t>Then he had gone down into the stillness to hold the stones, deeper than he had ever gone. He had found the floor of it. He had stood on that floor and held ten stones open over the fire and then let them close, and the others had gone out through the door, and he had turned to come back up the way he always came up.</w:t>
+        <w:t>Then he had gone down into the stillness to hold the stones, deeper than he had ever gone. He had found the floor of it. He had stood on that floor and held ten stones open over the fire and then let them close, and the others had gone out through the hole, and he had turned to come back up the way he always came up.</w:t>
       </w:r>
     </w:p>
     <w:p>
@@ -194,7 +194,7 @@
           <w:i w:val="0"/>
           <w:strike w:val="0"/>
         </w:rPr>
-        <w:t>They came from very far up, like voices down a shaft, flattened, their edges worn off by the distance. No words reached him. Only the shape of them: a lift at the end of a line, a pause, the lift again. One came more than the others. It had a pattern: a sentence, then a pause the exact length of a sentence, room left for a reply, then on without one. Patient, the way a person talks to a radio while he's got its back off. Otto almost knew that rhythm.</w:t>
+        <w:t>They came down from very far up, along some long shaft, flattened, their edges worn off by the distance. No words reached him. Only the shape of them: a lift at the end of a line, a pause, the lift again. One came more than the others. It had a pattern: a sentence, then a pause the exact length of a sentence, room left for a reply, then on without one. Patient, the way a person talks to a radio while he's got its back off. Otto almost knew that rhythm.</w:t>
       </w:r>
     </w:p>
     <w:p>
@@ -204,7 +204,7 @@
           <w:i w:val="0"/>
           <w:strike w:val="0"/>
         </w:rPr>
-        <w:t>Another came less often and said less. Mostly it sat. He could feel it through the blue, like one side of you going warm when you sit near a boulder that's been in the sun all day.</w:t>
+        <w:t>Another hardly talked at all. It just stayed, hour after hour, longer than anyone. He could feel it through the blue, one side of him warmer than the other.</w:t>
       </w:r>
     </w:p>
     <w:p>
@@ -324,7 +324,7 @@
           <w:i w:val="0"/>
           <w:strike w:val="0"/>
         </w:rPr>
-        <w:t>The butterfly was on his shoulder that night, opening and closing. The proof. Otto didn't look at it much. It made his chest go tight, and he didn't want a word for that.</w:t>
+        <w:t>The butterfly was on the old man's shoulder that night, opening and closing. The proof. Otto didn't look at it much. It made his chest go tight, and he didn't want a word for that.</w:t>
       </w:r>
     </w:p>
     <w:p>
@@ -334,7 +334,17 @@
           <w:i w:val="0"/>
           <w:strike w:val="0"/>
         </w:rPr>
-        <w:t>Later, when it was nearly full dark and the old man had sent him home twice and he hadn't gone, Shu Chan stood in a stance in the middle of the floor. Low, one foot forward, his weight sunk so far into the boards that the whole shed seemed to lean toward him. He held it so long Otto's own thighs burned to watch, and the big toe of his left foot lifted off the boards a hair and stayed lifted, like something under the floor was pulling at it and he was declining. And under his breath, so low it was nearly the breath itself, he said a word.</w:t>
+        <w:t>Somewhere above the shed the cool arrived, and the pull came into his arms, and went.</w:t>
+      </w:r>
+    </w:p>
+    <w:p>
+      <w:r>
+        <w:rPr>
+          <w:b w:val="0"/>
+          <w:i w:val="0"/>
+          <w:strike w:val="0"/>
+        </w:rPr>
+        <w:t>Later, when it was nearly full dark and the old man had sent him home twice and he hadn't gone, Shu Chan stood in a stance in the middle of the floor. Low, one foot forward, his weight sunk so far into the boards that the whole shed seemed to lean toward him. He held it so long Otto's own thighs burned to watch, and the big toe of his left foot lifted off the boards a hair and stayed lifted. And under his breath, so low it was nearly the breath itself, he said a word.</w:t>
       </w:r>
     </w:p>
     <w:p>
@@ -394,7 +404,7 @@
           <w:i w:val="0"/>
           <w:strike w:val="0"/>
         </w:rPr>
-        <w:t>He tried to rise. He tried often, or he thought he did; there was no time in here to count it by.</w:t>
+        <w:t>The one that stayed was there again. He knew it before he knew anything else: the warmth on his one side, not talking, not moving, not going away.</w:t>
       </w:r>
     </w:p>
     <w:p>
@@ -404,7 +414,7 @@
           <w:i w:val="0"/>
           <w:strike w:val="0"/>
         </w:rPr>
-        <w:t>It went the same way each time. He gathered himself the way Master Chan had taught him, breath first, weight sinking, and pushed. The push went into the stillness, and the stillness took it the way dry sand takes water, and gave back nothing but more calm. The harder he reached for the top, the deeper the floor went. He'd built the place to do exactly that, and he'd built it well.</w:t>
+        <w:t>It had been there a long while. It was not going to leave. And something in Otto that had been built to answer that kind of waiting put its feet under it and pushed.</w:t>
       </w:r>
     </w:p>
     <w:p>
@@ -414,7 +424,7 @@
           <w:i w:val="0"/>
           <w:strike w:val="0"/>
         </w:rPr>
-        <w:t>He looked for an edge. A wall, a hand, a weight on his chest, anything to set his feet against. There was nothing. The stillness was his own. He had made it breath by breath until it was deep enough to carry three lives, and he had made it so well that it had closed over his head.</w:t>
+        <w:t>He did it the way Master Chan had taught him. Breath first. Weight down into the floor of the place, and then up off it. The stillness gave. It had never given before, or he had never pushed from here before, with that warmth to push toward, and the blue thinned above him. He took a breath that was his. He felt it go in on its own and come out again, and he was the one doing it.</w:t>
       </w:r>
     </w:p>
     <w:p>
@@ -424,7 +434,48 @@
           <w:i w:val="0"/>
           <w:strike w:val="0"/>
         </w:rPr>
-        <w:t>He was not trapped. He was adapted. He had matched the room so perfectly that there was no longer any difference between him and the room, and a thing that is no different from the room cannot leave it.</w:t>
+        <w:t>And far off, out past the edge of what he could feel, in a hand he could not find, something moved. A finger, closing on nothing.</w:t>
+      </w:r>
+    </w:p>
+    <w:p>
+      <w:r>
+        <w:rPr>
+          <w:b w:val="0"/>
+          <w:i w:val="0"/>
+          <w:strike w:val="0"/>
+        </w:rPr>
+        <w:t>Then Gage's face came, upturned at the hole, the scar white, waiting for him to come down.</w:t>
+      </w:r>
+    </w:p>
+    <w:p>
+      <w:r>
+        <w:rPr>
+          <w:b w:val="0"/>
+          <w:i/>
+          <w:strike w:val="0"/>
+          <w:color w:val="5C6B7D"/>
+        </w:rPr>
+        <w:t>I promise, brother.</w:t>
+      </w:r>
+    </w:p>
+    <w:p>
+      <w:r>
+        <w:rPr>
+          <w:b w:val="0"/>
+          <w:i w:val="0"/>
+          <w:strike w:val="0"/>
+        </w:rPr>
+        <w:t>One more stone. He felt it settle, and he knew its weight now. It was the exact weight of a thing you said to make someone climb. The floor came up under him, the blue went deep again, and the stillness took the push, the way he had built it to.</w:t>
+      </w:r>
+    </w:p>
+    <w:p>
+      <w:r>
+        <w:rPr>
+          <w:b w:val="0"/>
+          <w:i w:val="0"/>
+          <w:strike w:val="0"/>
+        </w:rPr>
+        <w:t>The warmth was still there on his one side. The hand was still out there too, wherever it was. He hadn't known that. He'd thought nothing out past the blue could still move.</w:t>
       </w:r>
     </w:p>
     <w:p>
@@ -453,7 +504,7 @@
           <w:strike w:val="0"/>
           <w:color w:val="5C6B7D"/>
         </w:rPr>
-        <w:t>Top of the class.</w:t>
+        <w:t>You had a hand the whole time.</w:t>
       </w:r>
     </w:p>
     <w:p>

</xml_diff>

<commit_message>
Ch12 final: why the promise holds him; stone sequence; Master Chan throughout
Co-Authored-By: Claude Opus 5.5 <noreply@anthropic.com>
</commit_message>
<xml_diff>
--- a/claude-notes/manuscript-v2/12-now-in-the-blue-i-merged.docx
+++ b/claude-notes/manuscript-v2/12-now-in-the-blue-i-merged.docx
@@ -154,7 +154,7 @@
           <w:i w:val="0"/>
           <w:strike w:val="0"/>
         </w:rPr>
-        <w:t>Then he had gone down into the stillness to hold the stones, deeper than he had ever gone. He had found the floor of it. He had stood on that floor and held ten stones open over the fire and then let them close, and the others had gone out through the hole, and he had turned to come back up the way he always came up.</w:t>
+        <w:t>Then he had gone down into the stillness to hold the stones, deeper than he had ever gone. He had found the floor of it. He had stood on that floor and held ten stones open over the fire until the others were out through the hole, and then let them close, and he had turned to come back up the way he always came up.</w:t>
       </w:r>
     </w:p>
     <w:p>
@@ -234,7 +234,7 @@
           <w:i w:val="0"/>
           <w:strike w:val="0"/>
         </w:rPr>
-        <w:t>"Again," Shu Chan said.</w:t>
+        <w:t>"Again," Master Chan said.</w:t>
       </w:r>
     </w:p>
     <w:p>
@@ -294,7 +294,7 @@
           <w:i w:val="0"/>
           <w:strike w:val="0"/>
         </w:rPr>
-        <w:t>"The chair has done nothing to you." Shu Chan's hand rested on his own knee, and at its edge, where the skin met the dark of the shed, there was the blue: faint, the shimmer that comes off a slag heap at noon. "The fist is the last thing, Otto. Everything else comes first. The fist is what is left when you have run out of better ideas."</w:t>
+        <w:t>"The chair has done nothing to you." Master Chan's hand rested on his own knee, and at its edge, where the skin met the dark of the shed, there was the blue: faint, the shimmer that comes off a slag heap at noon. "The fist is the last thing, Otto. Everything else comes first. The fist is what is left when you have run out of better ideas."</w:t>
       </w:r>
     </w:p>
     <w:p>
@@ -344,7 +344,7 @@
           <w:i w:val="0"/>
           <w:strike w:val="0"/>
         </w:rPr>
-        <w:t>Later, when it was nearly full dark and the old man had sent him home twice and he hadn't gone, Shu Chan stood in a stance in the middle of the floor. Low, one foot forward, his weight sunk so far into the boards that the whole shed seemed to lean toward him. He held it so long Otto's own thighs burned to watch, and the big toe of his left foot lifted off the boards a hair and stayed lifted. And under his breath, so low it was nearly the breath itself, he said a word.</w:t>
+        <w:t>Later, when it was nearly full dark and the old man had sent him home twice and he hadn't gone, Master Chan stood in a stance in the middle of the floor. Low, one foot forward, his weight sunk so far into the boards that the whole shed seemed to lean toward him. He held it so long Otto's own thighs burned to watch, and the big toe of his left foot lifted off the boards a hair and stayed lifted. And under his breath, so low it was nearly the breath itself, he said a word.</w:t>
       </w:r>
     </w:p>
     <w:p>
@@ -374,7 +374,7 @@
           <w:i w:val="0"/>
           <w:strike w:val="0"/>
         </w:rPr>
-        <w:t>Shu Chan wiped his palms down his trousers. He looked at the door, which was shut, and somewhere past it.</w:t>
+        <w:t>Master Chan wiped his palms down his trousers. He looked at the door, which was shut, and somewhere past it.</w:t>
       </w:r>
     </w:p>
     <w:p>
@@ -424,7 +424,7 @@
           <w:i w:val="0"/>
           <w:strike w:val="0"/>
         </w:rPr>
-        <w:t>He did it the way Master Chan had taught him. Breath first. Weight down into the floor of the place, and then up off it. The stillness gave. It had never given before, or he had never pushed from here before, with that warmth to push toward, and the blue thinned above him. He took a breath that was his. He felt it go in on its own and come out again, and he was the one doing it.</w:t>
+        <w:t>He did it the way Master Chan had taught him. Breath first. Weight down into the floor of the place, and then up off it. The stillness gave. It had never given before. He had never had anything to push toward. The blue thinned above him. He took a breath that was his. He felt it go in on its own and come out again, and he was the one doing it.</w:t>
       </w:r>
     </w:p>
     <w:p>
@@ -465,7 +465,7 @@
           <w:i w:val="0"/>
           <w:strike w:val="0"/>
         </w:rPr>
-        <w:t>One more stone. He felt it settle, and he knew its weight now. It was the exact weight of a thing you said to make someone climb. The floor came up under him, the blue went deep again, and the stillness took the push, the way he had built it to.</w:t>
+        <w:t>One more stone. He felt it settle, and he knew its weight now. If he came up, he'd have to look at that face and be the brother who lied. Down here he was still the one holding the stones. The floor came up under him, the blue went deep again, and the stillness took the push, the way he had built it to.</w:t>
       </w:r>
     </w:p>
     <w:p>

</xml_diff>